<commit_message>
Inline report competency markers
Co-authored-by: Dmitry <Enotfttp@users.noreply.github.com>
</commit_message>
<xml_diff>
--- a/src/Preddiplomnaya_praktika_Tezyaeva-4.docx
+++ b/src/Preddiplomnaya_praktika_Tezyaeva-4.docx
@@ -1196,19 +1196,6 @@
     </w:p>
     <w:p>
       <w:pPr>
-        <w:spacing w:line="360" w:lineRule="auto" w:after="120"/>
-      </w:pPr>
-      <w:r>
-        <w:rPr>
-          <w:rFonts w:ascii="Times New Roman" w:hAnsi="Times New Roman"/>
-          <w:b/>
-          <w:sz w:val="28"/>
-        </w:rPr>
-        <w:t>УК-2</w:t>
-      </w:r>
-    </w:p>
-    <w:p>
-      <w:pPr>
         <w:keepNext w:val="0"/>
         <w:keepLines w:val="0"/>
         <w:pageBreakBefore w:val="0"/>
@@ -1242,7 +1229,14 @@
       <w:r>
         <w:rPr>
           <w:rFonts w:ascii="Times New Roman" w:hAnsi="Times New Roman"/>
-          <w:b w:val="0"/>
+          <w:b/>
+          <w:sz w:val="28"/>
+        </w:rPr>
+        <w:t xml:space="preserve">(УК-2) </w:t>
+      </w:r>
+      <w:r>
+        <w:rPr>
+          <w:rFonts w:ascii="Times New Roman" w:hAnsi="Times New Roman"/>
           <w:sz w:val="28"/>
         </w:rPr>
         <w:t>Закупочная деятельность ООО «Лайф Медиа» основана на постоянном мониторинге электронных торговых площадок (ЕТП), таких как СберАСТ, РТС-Тендер, ЭТП ГПБ, и Единой информационной системы в сфере закупок (ЕИС). Бизнес-модель компании предполагает поиск лотов, начальная максимальная цена контракта (НМЦК) которых позволяет приобрести оборудование у производителя или дистрибьютора со скидкой, обеспечивающей маржу не менее 10-15%. Процесс участия в тендере включает следующие этапы: Нормативной основой указанной деятельности являются положения 44-ФЗ и 223-ФЗ [2; 3].</w:t>
@@ -1643,19 +1637,6 @@
     </w:p>
     <w:p>
       <w:pPr>
-        <w:spacing w:line="360" w:lineRule="auto" w:after="120"/>
-      </w:pPr>
-      <w:r>
-        <w:rPr>
-          <w:rFonts w:ascii="Times New Roman" w:hAnsi="Times New Roman"/>
-          <w:b/>
-          <w:sz w:val="28"/>
-        </w:rPr>
-        <w:t>УК-4</w:t>
-      </w:r>
-    </w:p>
-    <w:p>
-      <w:pPr>
         <w:keepNext w:val="0"/>
         <w:keepLines w:val="0"/>
         <w:pageBreakBefore w:val="0"/>
@@ -1688,12 +1669,16 @@
       </w:pPr>
       <w:r>
         <w:rPr>
-          <w:rFonts w:hint="default" w:ascii="Times New Roman" w:hAnsi="Times New Roman"/>
-          <w:b w:val="0"/>
-          <w:bCs w:val="0"/>
-          <w:sz w:val="28"/>
-          <w:szCs w:val="28"/>
-          <w:lang w:val="ru-RU"/>
+          <w:rFonts w:ascii="Times New Roman" w:hAnsi="Times New Roman"/>
+          <w:b/>
+          <w:sz w:val="28"/>
+        </w:rPr>
+        <w:t xml:space="preserve">(УК-4) </w:t>
+      </w:r>
+      <w:r>
+        <w:rPr>
+          <w:rFonts w:ascii="Times New Roman" w:hAnsi="Times New Roman"/>
+          <w:sz w:val="28"/>
         </w:rPr>
         <w:t>Цифровая инфраструктура компании включает в себя следующие элементы:</w:t>
       </w:r>
@@ -1876,19 +1861,6 @@
     </w:p>
     <w:p>
       <w:pPr>
-        <w:spacing w:line="360" w:lineRule="auto" w:after="120"/>
-      </w:pPr>
-      <w:r>
-        <w:rPr>
-          <w:rFonts w:ascii="Times New Roman" w:hAnsi="Times New Roman"/>
-          <w:b/>
-          <w:sz w:val="28"/>
-        </w:rPr>
-        <w:t>УК-10</w:t>
-      </w:r>
-    </w:p>
-    <w:p>
-      <w:pPr>
         <w:keepNext w:val="0"/>
         <w:keepLines w:val="0"/>
         <w:pageBreakBefore w:val="0"/>
@@ -1921,12 +1893,16 @@
       </w:pPr>
       <w:r>
         <w:rPr>
-          <w:rFonts w:hint="default" w:ascii="Times New Roman" w:hAnsi="Times New Roman"/>
-          <w:b w:val="0"/>
-          <w:bCs w:val="0"/>
-          <w:sz w:val="28"/>
-          <w:szCs w:val="28"/>
-          <w:lang w:val="ru-RU"/>
+          <w:rFonts w:ascii="Times New Roman" w:hAnsi="Times New Roman"/>
+          <w:b/>
+          <w:sz w:val="28"/>
+        </w:rPr>
+        <w:t xml:space="preserve">(УК-10) </w:t>
+      </w:r>
+      <w:r>
+        <w:rPr>
+          <w:rFonts w:ascii="Times New Roman" w:hAnsi="Times New Roman"/>
+          <w:sz w:val="28"/>
         </w:rPr>
         <w:t>Проведём анализ основных финансово-экономических показателей за последние 3 года (2022-2025 гг.), чтобы выявить основные тенденции развития компании и функционирование тендерного отдела (см.табл.1.1.)</w:t>
       </w:r>
@@ -5394,19 +5370,6 @@
     </w:p>
     <w:p>
       <w:pPr>
-        <w:spacing w:line="360" w:lineRule="auto" w:after="120"/>
-      </w:pPr>
-      <w:r>
-        <w:rPr>
-          <w:rFonts w:ascii="Times New Roman" w:hAnsi="Times New Roman"/>
-          <w:b/>
-          <w:sz w:val="28"/>
-        </w:rPr>
-        <w:t>ПК-1</w:t>
-      </w:r>
-    </w:p>
-    <w:p>
-      <w:pPr>
         <w:spacing w:after="120" w:line="360" w:lineRule="auto"/>
         <w:ind w:firstLine="700"/>
         <w:jc w:val="both"/>
@@ -5414,7 +5377,14 @@
       <w:r>
         <w:rPr>
           <w:rFonts w:ascii="Times New Roman" w:hAnsi="Times New Roman"/>
-          <w:b w:val="0"/>
+          <w:b/>
+          <w:sz w:val="28"/>
+        </w:rPr>
+        <w:t xml:space="preserve">(ПК-1) </w:t>
+      </w:r>
+      <w:r>
+        <w:rPr>
+          <w:rFonts w:ascii="Times New Roman" w:hAnsi="Times New Roman"/>
           <w:sz w:val="28"/>
         </w:rPr>
         <w:t>Система управления персоналом ООО «Лайф Медиа» формируется с учётом двух особенностей предприятия: малого масштаба бизнеса и полностью удалённого формата работы большинства сотрудников. В компании отсутствует самостоятельная HR-служба, поэтому кадровые функции распределены между несколькими участниками управления. Генеральный директор принимает ключевые кадровые решения и определяет требования к персоналу, руководитель тендерного отдела участвует в подборе, оценке и текущей координации специалистов, бухгалтерия обеспечивает кадровое делопроизводство, расчёт заработной платы и оформление обязательных документов [4; 5].</w:t>
@@ -5437,19 +5407,6 @@
     </w:p>
     <w:p>
       <w:pPr>
-        <w:spacing w:line="360" w:lineRule="auto" w:after="120"/>
-      </w:pPr>
-      <w:r>
-        <w:rPr>
-          <w:rFonts w:ascii="Times New Roman" w:hAnsi="Times New Roman"/>
-          <w:b/>
-          <w:sz w:val="28"/>
-        </w:rPr>
-        <w:t>ПК-2</w:t>
-      </w:r>
-    </w:p>
-    <w:p>
-      <w:pPr>
         <w:spacing w:after="120" w:line="360" w:lineRule="auto"/>
         <w:ind w:firstLine="700"/>
         <w:jc w:val="both"/>
@@ -5457,44 +5414,17 @@
       <w:r>
         <w:rPr>
           <w:rFonts w:ascii="Times New Roman" w:hAnsi="Times New Roman"/>
-          <w:b w:val="0"/>
-          <w:sz w:val="28"/>
-        </w:rPr>
-        <w:t>Поиск персонала носит проектный характер и чаще всего связан с потребностями тендерного отдела. Основными каналами привлечения выступают hh.ru, Авито, Работа.ru и профессиональные рекомендации. Важным преимуществом работодателя является удал</w:t>
+          <w:b/>
+          <w:sz w:val="28"/>
+        </w:rPr>
+        <w:t xml:space="preserve">(ПК-2) </w:t>
       </w:r>
       <w:r>
         <w:rPr>
           <w:rFonts w:ascii="Times New Roman" w:hAnsi="Times New Roman"/>
-          <w:b w:val="0"/>
-          <w:sz w:val="28"/>
-          <w:lang w:val="ru-RU"/>
-        </w:rPr>
-        <w:t>ё</w:t>
-      </w:r>
-      <w:r>
-        <w:rPr>
-          <w:rFonts w:ascii="Times New Roman" w:hAnsi="Times New Roman"/>
-          <w:b w:val="0"/>
-          <w:sz w:val="28"/>
-        </w:rPr>
-        <w:t>нный формат, позволяющий привлекать кандидатов не только из Нижнего Новгорода, но и из других регионов. При этом удал</w:t>
-      </w:r>
-      <w:r>
-        <w:rPr>
-          <w:rFonts w:ascii="Times New Roman" w:hAnsi="Times New Roman"/>
-          <w:b w:val="0"/>
-          <w:sz w:val="28"/>
-          <w:lang w:val="ru-RU"/>
-        </w:rPr>
-        <w:t>ё</w:t>
-      </w:r>
-      <w:r>
-        <w:rPr>
-          <w:rFonts w:ascii="Times New Roman" w:hAnsi="Times New Roman"/>
-          <w:b w:val="0"/>
-          <w:sz w:val="28"/>
-        </w:rPr>
-        <w:t>нная занятость повышает требования к самостоятельности, цифровой дисциплине и умению работать с электронными документами.</w:t>
+          <w:sz w:val="28"/>
+        </w:rPr>
+        <w:t>Поиск персонала носит проектный характер и чаще всего связан с потребностями тендерного отдела. Основными каналами привлечения выступают hh.ru, Авито, Работа.ru и профессиональные рекомендации. Важным преимуществом работодателя является удалённый формат, позволяющий привлекать кандидатов не только из Нижнего Новгорода, но и из других регионов. При этом удалённая занятость повышает требования к самостоятельности, цифровой дисциплине и умению работать с электронными документами.</w:t>
       </w:r>
     </w:p>
     <w:p>
@@ -7442,19 +7372,6 @@
     </w:p>
     <w:p>
       <w:pPr>
-        <w:spacing w:line="360" w:lineRule="auto" w:after="120"/>
-      </w:pPr>
-      <w:r>
-        <w:rPr>
-          <w:rFonts w:ascii="Times New Roman" w:hAnsi="Times New Roman"/>
-          <w:b/>
-          <w:sz w:val="28"/>
-        </w:rPr>
-        <w:t>ДПК-1</w:t>
-      </w:r>
-    </w:p>
-    <w:p>
-      <w:pPr>
         <w:spacing w:after="120" w:line="360" w:lineRule="auto"/>
         <w:ind w:firstLine="700"/>
         <w:jc w:val="both"/>
@@ -7462,27 +7379,17 @@
       <w:r>
         <w:rPr>
           <w:rFonts w:ascii="Times New Roman" w:hAnsi="Times New Roman"/>
-          <w:b w:val="0"/>
-          <w:sz w:val="28"/>
-        </w:rPr>
-        <w:t>Образовательная структура также неоднородна. Профильное высшее образование имеют 3 специалиста, тогда как 5 сотрудников обладают непрофильным или средним профессиональным образованием. Это не означает невозможность эффективной работы, но повышает значение внутренней адаптации, передачи практических знаний и регулярного обновления компетенций, особенно с уч</w:t>
+          <w:b/>
+          <w:sz w:val="28"/>
+        </w:rPr>
+        <w:t xml:space="preserve">(ДПК-1) </w:t>
       </w:r>
       <w:r>
         <w:rPr>
           <w:rFonts w:ascii="Times New Roman" w:hAnsi="Times New Roman"/>
-          <w:b w:val="0"/>
-          <w:sz w:val="28"/>
-          <w:lang w:val="ru-RU"/>
-        </w:rPr>
-        <w:t>ё</w:t>
-      </w:r>
-      <w:r>
-        <w:rPr>
-          <w:rFonts w:ascii="Times New Roman" w:hAnsi="Times New Roman"/>
-          <w:b w:val="0"/>
-          <w:sz w:val="28"/>
-        </w:rPr>
-        <w:t>том изменений законодательства о закупках.</w:t>
+          <w:sz w:val="28"/>
+        </w:rPr>
+        <w:t>Образовательная структура также неоднородна. Профильное высшее образование имеют 3 специалиста, тогда как 5 сотрудников обладают непрофильным или средним профессиональным образованием. Это не означает невозможность эффективной работы, но повышает значение внутренней адаптации, передачи практических знаний и регулярного обновления компетенций, особенно с учётом изменений законодательства о закупках.</w:t>
       </w:r>
     </w:p>
     <w:p>
@@ -8194,19 +8101,6 @@
     </w:p>
     <w:p>
       <w:pPr>
-        <w:spacing w:line="360" w:lineRule="auto" w:after="120"/>
-      </w:pPr>
-      <w:r>
-        <w:rPr>
-          <w:rFonts w:ascii="Times New Roman" w:hAnsi="Times New Roman"/>
-          <w:b/>
-          <w:sz w:val="28"/>
-        </w:rPr>
-        <w:t>ДПК-5</w:t>
-      </w:r>
-    </w:p>
-    <w:p>
-      <w:pPr>
         <w:spacing w:after="120" w:line="360" w:lineRule="auto"/>
         <w:ind w:firstLine="700"/>
         <w:jc w:val="both"/>
@@ -8220,19 +8114,17 @@
       <w:r>
         <w:rPr>
           <w:rFonts w:ascii="Times New Roman" w:hAnsi="Times New Roman"/>
-          <w:b w:val="0"/>
-          <w:sz w:val="28"/>
-        </w:rPr>
-        <w:t>Мотивация персонала в ООО «Лайф Медиа» построена на сочетании материальных и нематериальных факторов. Материальная часть закреплена в системе оплаты труда и премирования</w:t>
+          <w:b/>
+          <w:sz w:val="28"/>
+        </w:rPr>
+        <w:t xml:space="preserve">(ДПК-5) </w:t>
       </w:r>
       <w:r>
         <w:rPr>
-          <w:rFonts w:hint="default" w:ascii="Times New Roman" w:hAnsi="Times New Roman"/>
-          <w:b w:val="0"/>
-          <w:sz w:val="28"/>
-          <w:lang w:val="ru-RU"/>
-        </w:rPr>
-        <w:t xml:space="preserve"> (см.табл.2.6-2.7.).</w:t>
+          <w:rFonts w:ascii="Times New Roman" w:hAnsi="Times New Roman"/>
+          <w:sz w:val="28"/>
+        </w:rPr>
+        <w:t>Мотивация персонала в ООО «Лайф Медиа» построена на сочетании материальных и нематериальных факторов. Материальная часть закреплена в системе оплаты труда и премирования (см.табл.2.6-2.7.).</w:t>
       </w:r>
     </w:p>
     <w:p>
@@ -8958,19 +8850,6 @@
     </w:p>
     <w:p>
       <w:pPr>
-        <w:spacing w:line="360" w:lineRule="auto" w:after="120"/>
-      </w:pPr>
-      <w:r>
-        <w:rPr>
-          <w:rFonts w:ascii="Times New Roman" w:hAnsi="Times New Roman"/>
-          <w:b/>
-          <w:sz w:val="28"/>
-        </w:rPr>
-        <w:t>ДПК-6</w:t>
-      </w:r>
-    </w:p>
-    <w:p>
-      <w:pPr>
         <w:spacing w:after="120" w:line="360" w:lineRule="auto"/>
         <w:ind w:firstLine="700"/>
         <w:jc w:val="both"/>
@@ -8978,7 +8857,14 @@
       <w:r>
         <w:rPr>
           <w:rFonts w:ascii="Times New Roman" w:hAnsi="Times New Roman"/>
-          <w:b w:val="0"/>
+          <w:b/>
+          <w:sz w:val="28"/>
+        </w:rPr>
+        <w:t xml:space="preserve">(ДПК-6) </w:t>
+      </w:r>
+      <w:r>
+        <w:rPr>
+          <w:rFonts w:ascii="Times New Roman" w:hAnsi="Times New Roman"/>
           <w:sz w:val="28"/>
         </w:rPr>
         <w:t>Сильными сторонами мотивации являются прозрачность KPI, удалённый формат и гибкость рабочего графика. Однако действующая система почти не связана с профессиональным развитием. Премирование ориентировано на результат работы, но не выделяет обучение, наставничество или передачу опыта как самостоятельные ценности. В условиях высокой текучести это снижает заинтересованность опытных сотрудников в системной помощи новичкам и не создаёт устойчивого механизма накопления знаний внутри отдела [7].</w:t>
@@ -10759,19 +10645,6 @@
     </w:p>
     <w:p>
       <w:pPr>
-        <w:spacing w:line="360" w:lineRule="auto" w:after="120"/>
-      </w:pPr>
-      <w:r>
-        <w:rPr>
-          <w:rFonts w:ascii="Times New Roman" w:hAnsi="Times New Roman"/>
-          <w:b/>
-          <w:sz w:val="28"/>
-        </w:rPr>
-        <w:t>ПК-4</w:t>
-      </w:r>
-    </w:p>
-    <w:p>
-      <w:pPr>
         <w:keepNext w:val="0"/>
         <w:keepLines w:val="0"/>
         <w:pageBreakBefore w:val="0"/>
@@ -10805,52 +10678,20 @@
       </w:pPr>
       <w:r>
         <w:rPr>
-          <w:rFonts w:hint="default" w:ascii="Times New Roman" w:hAnsi="Times New Roman"/>
-          <w:b w:val="0"/>
-          <w:bCs w:val="0"/>
-          <w:color w:val="auto"/>
-          <w:sz w:val="28"/>
-          <w:szCs w:val="28"/>
-          <w:lang w:val="ru-RU"/>
-        </w:rPr>
-        <w:t>Тендерный отдел ООО «Лайф Медиа» является ключевым подразделением компании, так как именно через участие в государственных корпоративных закупках формируется основная часть выручки. Работа специалистов отдела связана с постоянным анализом документации заказчиков, отслеживанием изменений в законодательстве, расчётом ценовых предложений, подготовкой комплектов документов и технической</w:t>
+          <w:rFonts w:ascii="Times New Roman" w:hAnsi="Times New Roman"/>
+          <w:b/>
+          <w:sz w:val="28"/>
+        </w:rPr>
+        <w:t xml:space="preserve">(ПК-4) </w:t>
       </w:r>
       <w:r>
         <w:rPr>
-          <w:rFonts w:hint="default" w:ascii="Times New Roman" w:hAnsi="Times New Roman"/>
-          <w:b w:val="0"/>
-          <w:bCs w:val="0"/>
-          <w:color w:val="auto"/>
-          <w:sz w:val="28"/>
-          <w:szCs w:val="28"/>
-          <w:lang w:val="ru-RU"/>
-        </w:rPr>
+          <w:rFonts w:ascii="Times New Roman" w:hAnsi="Times New Roman"/>
+          <w:sz w:val="28"/>
+        </w:rPr>
+        <w:t>Тендерный отдел ООО «Лайф Медиа» является ключевым подразделением компании, так как именно через участие в государственных корпоративных закупках формируется основная часть выручки. Работа специалистов отдела связана с постоянным анализом документации заказчиков, отслеживанием изменений в законодательстве, расчётом ценовых предложений, подготовкой комплектов документов и технической</w:t>
         <w:tab/>
-      </w:r>
-      <w:r>
-        <w:rPr>
-          <w:rFonts w:hint="default" w:ascii="Times New Roman" w:hAnsi="Times New Roman"/>
-          <w:b w:val="0"/>
-          <w:bCs w:val="0"/>
-          <w:color w:val="auto"/>
-          <w:sz w:val="28"/>
-          <w:szCs w:val="28"/>
-          <w:lang w:val="ru-RU"/>
-        </w:rPr>
         <w:t xml:space="preserve"> подачей заявок на электронных торговых площадках (ЭТП). При таком характере деятельности квалификация сотрудников напрямую влияет не только на качество выполнения отдельных операций, но и на финансовый результат компании.</w:t>
-      </w:r>
-    </w:p>
-    <w:p>
-      <w:pPr>
-        <w:spacing w:line="360" w:lineRule="auto" w:after="120"/>
-      </w:pPr>
-      <w:r>
-        <w:rPr>
-          <w:rFonts w:ascii="Times New Roman" w:hAnsi="Times New Roman"/>
-          <w:b/>
-          <w:sz w:val="28"/>
-        </w:rPr>
-        <w:t>УК-6</w:t>
       </w:r>
     </w:p>
     <w:p>
@@ -10889,7 +10730,14 @@
       <w:r>
         <w:rPr>
           <w:rFonts w:ascii="Times New Roman" w:hAnsi="Times New Roman"/>
-          <w:b w:val="0"/>
+          <w:b/>
+          <w:sz w:val="28"/>
+        </w:rPr>
+        <w:t xml:space="preserve">(УК-6) </w:t>
+      </w:r>
+      <w:r>
+        <w:rPr>
+          <w:rFonts w:ascii="Times New Roman" w:hAnsi="Times New Roman"/>
           <w:sz w:val="28"/>
         </w:rPr>
         <w:t>Несмотря на высокую значимость тендерного отдела, в компании отсутствует целостная система обучения и развития персонала. Под системой обучения в данном случае понимается не разовое направление сотрудников на курс или самостоятельное изучение материалов, а совокупность взаимосвязанных элементов: вводная адаптация новых работников, регулярное обновление знаний, разбор ошибок, единая база знаний, наставничество и оценка влияния обучения на рабочие показатели. В ООО «Лайф Медиа» такие элементы либо полностью отсутствуют, либо существуют фрагментарно и не связаны между собой [4; 8].</w:t>
@@ -12050,19 +11898,6 @@
     </w:p>
     <w:p>
       <w:pPr>
-        <w:spacing w:line="360" w:lineRule="auto" w:after="120"/>
-      </w:pPr>
-      <w:r>
-        <w:rPr>
-          <w:rFonts w:ascii="Times New Roman" w:hAnsi="Times New Roman"/>
-          <w:b/>
-          <w:sz w:val="28"/>
-        </w:rPr>
-        <w:t>УК-1</w:t>
-      </w:r>
-    </w:p>
-    <w:p>
-      <w:pPr>
         <w:spacing w:after="120" w:line="360" w:lineRule="auto"/>
         <w:ind w:firstLine="700"/>
         <w:jc w:val="both"/>
@@ -12076,13 +11911,18 @@
       </w:pPr>
       <w:r>
         <w:rPr>
-          <w:rFonts w:hint="default" w:ascii="Times New Roman" w:hAnsi="Times New Roman"/>
-          <w:b w:val="0"/>
-          <w:i w:val="0"/>
-          <w:sz w:val="28"/>
-          <w:lang w:val="ru-RU"/>
-        </w:rPr>
-        <w:t xml:space="preserve">Чтобы оценить насколько отсутствие системного обучения отражается на деятельности тендерного отдела, необходимо рассмотреть показатели участия компании в закупках (см.табл.3.2.). Для ООО «Лайф Медиа» важны не только количество поданных заявок и число выигранных контрактов, но и доля заявок, признанных соответствующими требованиям заказчика. Именно этот показатель отражает, насколько качественно сотрудники выполняют подготовительный этап работы: проверяют документацию, собирают обязательные формы, соблюдают требования к файлам, срокам и электронной подписи. </w:t>
+          <w:rFonts w:ascii="Times New Roman" w:hAnsi="Times New Roman"/>
+          <w:b/>
+          <w:sz w:val="28"/>
+        </w:rPr>
+        <w:t xml:space="preserve">(УК-1) </w:t>
+      </w:r>
+      <w:r>
+        <w:rPr>
+          <w:rFonts w:ascii="Times New Roman" w:hAnsi="Times New Roman"/>
+          <w:sz w:val="28"/>
+        </w:rPr>
+        <w:t>Чтобы оценить насколько отсутствие системного обучения отражается на деятельности тендерного отдела, необходимо рассмотреть показатели участия компании в закупках (см.табл.3.2.). Для ООО «Лайф Медиа» важны не только количество поданных заявок и число выигранных контрактов, но и доля заявок, признанных соответствующими требованиям заказчика. Именно этот показатель отражает, насколько качественно сотрудники выполняют подготовительный этап работы: проверяют документацию, собирают обязательные формы, соблюдают требования к файлам, срокам и электронной подписи.</w:t>
       </w:r>
     </w:p>
     <w:p>
@@ -13694,19 +13534,6 @@
     </w:p>
     <w:p>
       <w:pPr>
-        <w:spacing w:line="360" w:lineRule="auto" w:after="120"/>
-      </w:pPr>
-      <w:r>
-        <w:rPr>
-          <w:rFonts w:ascii="Times New Roman" w:hAnsi="Times New Roman"/>
-          <w:b/>
-          <w:sz w:val="28"/>
-        </w:rPr>
-        <w:t>УК-3</w:t>
-      </w:r>
-    </w:p>
-    <w:p>
-      <w:pPr>
         <w:spacing w:after="120" w:line="360" w:lineRule="auto"/>
         <w:ind w:firstLine="700"/>
         <w:jc w:val="both"/>
@@ -13720,33 +13547,18 @@
       </w:pPr>
       <w:r>
         <w:rPr>
-          <w:rFonts w:hint="default" w:ascii="Times New Roman" w:hAnsi="Times New Roman"/>
-          <w:b w:val="0"/>
-          <w:i w:val="0"/>
-          <w:sz w:val="28"/>
-          <w:lang w:val="ru-RU"/>
-        </w:rPr>
-        <w:t xml:space="preserve">Для уточнения внутренней оценки ситуации 14 апреля 2026 года был проведён опрос в </w:t>
+          <w:rFonts w:ascii="Times New Roman" w:hAnsi="Times New Roman"/>
+          <w:b/>
+          <w:sz w:val="28"/>
+        </w:rPr>
+        <w:t xml:space="preserve">(УК-3) </w:t>
       </w:r>
       <w:r>
         <w:rPr>
-          <w:rFonts w:hint="default" w:ascii="Times New Roman" w:hAnsi="Times New Roman"/>
-          <w:b w:val="0"/>
-          <w:i w:val="0"/>
-          <w:sz w:val="28"/>
-          <w:lang w:val="en-US"/>
-        </w:rPr>
-        <w:t>google</w:t>
-      </w:r>
-      <w:r>
-        <w:rPr>
-          <w:rFonts w:hint="default" w:ascii="Times New Roman" w:hAnsi="Times New Roman"/>
-          <w:b w:val="0"/>
-          <w:i w:val="0"/>
-          <w:sz w:val="28"/>
-          <w:lang w:val="ru-RU"/>
-        </w:rPr>
-        <w:t>-форме сотрудников тендерного отдела ООО «Лайф Медиа». в опросе участвовали все 8 специалистов. Цель была в том, чтобы определить как сами сотрудники оценивают действующий порядок обучения, какие источники знаний используют в работе, с какими трудностями сталкиваются и какие профессиональные темы считают наиболее значимыми для дальнейшего освоения. Опрос носит диагностический характер и служит базой для разработки рекомендаций.</w:t>
+          <w:rFonts w:ascii="Times New Roman" w:hAnsi="Times New Roman"/>
+          <w:sz w:val="28"/>
+        </w:rPr>
+        <w:t>Для уточнения внутренней оценки ситуации 14 апреля 2026 года был проведён опрос в google-форме сотрудников тендерного отдела ООО «Лайф Медиа». в опросе участвовали все 8 специалистов. Цель была в том, чтобы определить как сами сотрудники оценивают действующий порядок обучения, какие источники знаний используют в работе, с какими трудностями сталкиваются и какие профессиональные темы считают наиболее значимыми для дальнейшего освоения. Опрос носит диагностический характер и служит базой для разработки рекомендаций.</w:t>
       </w:r>
     </w:p>
     <w:p>
@@ -18460,10 +18272,17 @@
       <w:r>
         <w:rPr>
           <w:rFonts w:ascii="Times New Roman" w:hAnsi="Times New Roman"/>
-          <w:b w:val="0"/>
-          <w:sz w:val="28"/>
-        </w:rPr>
-        <w:t>ПК-5 — компетенция, связанная с разработкой проектов социального партнерства при решении задач управления персоналом и оценкой их социально-экономической эффективности. В рамках данного отчета отдельный проект социального партнерства не разрабатывался, поэтому компетенция вынесена в глоссарий.</w:t>
+          <w:b/>
+          <w:sz w:val="28"/>
+        </w:rPr>
+        <w:t>ПК-5</w:t>
+      </w:r>
+      <w:r>
+        <w:rPr>
+          <w:rFonts w:ascii="Times New Roman" w:hAnsi="Times New Roman"/>
+          <w:sz w:val="28"/>
+        </w:rPr>
+        <w:t xml:space="preserve"> — компетенция, связанная с разработкой проектов социального партнерства при решении задач управления персоналом и оценкой их социально-экономической эффективности. В рамках данного отчета отдельный проект социального партнерства не разрабатывался, поэтому компетенция вынесена в глоссарий.</w:t>
       </w:r>
     </w:p>
     <w:p>
@@ -18474,10 +18293,17 @@
       <w:r>
         <w:rPr>
           <w:rFonts w:ascii="Times New Roman" w:hAnsi="Times New Roman"/>
-          <w:b w:val="0"/>
-          <w:sz w:val="28"/>
-        </w:rPr>
-        <w:t>ПК-6 — компетенция, связанная с реализацией программ организационных изменений в сфере управления персоналом, в том числе в кризисных ситуациях. В отчете рассматривается диагностика текущего состояния управления персоналом и обучения, но программа организационных изменений не является предметом разделов, поэтому компетенция вынесена в глоссарий.</w:t>
+          <w:b/>
+          <w:sz w:val="28"/>
+        </w:rPr>
+        <w:t>ПК-6</w:t>
+      </w:r>
+      <w:r>
+        <w:rPr>
+          <w:rFonts w:ascii="Times New Roman" w:hAnsi="Times New Roman"/>
+          <w:sz w:val="28"/>
+        </w:rPr>
+        <w:t xml:space="preserve"> — компетенция, связанная с реализацией программ организационных изменений в сфере управления персоналом, в том числе в кризисных ситуациях. В отчете рассматривается диагностика текущего состояния управления персоналом и обучения, но программа организационных изменений не является предметом разделов, поэтому компетенция вынесена в глоссарий.</w:t>
       </w:r>
     </w:p>
     <w:p>

</xml_diff>